<commit_message>
Serve the updated CV from public/cv for the download button.
The Nuxt site was still shipping the old PDF from public/cv while the edited file lived only under cv/.

Co-authored-by: Cursor <cursoragent@cursor.com>
</commit_message>
<xml_diff>
--- a/cv/Douglas_da_Cruz_Martins.docx
+++ b/cv/Douglas_da_Cruz_Martins.docx
@@ -138,7 +138,7 @@
           <w:sz w:val="20"/>
           <w:szCs w:val="20"/>
         </w:rPr>
-        <w:t xml:space="preserve">Desenvolvedor Full Stack com mais de 9 anos de experiência no desenvolvimento e evolução de aplicações web de alta criticidade, com foco em PHP, Laravel, MySQL, JavaScript e Vue.js. Atuação em plataformas de e-commerce, pagamentos e produtos digitais — incluindo cerca de 6 anos no ecossistema Locaweb/LWSA (Desk360 e Tray) — com modernização de sistemas legados, otimização de consultas, mensageria (RabbitMQ), integração com APIs externas, controle de acesso (ACL) e segurança de aplicações (OWASP, 2FA). Experiência no desenvolvimento de APIs REST, interfaces em Vue.js/Nuxt, testes automatizados (Pest), observabilidade (Datadog e New Relic) e arquitetura com Clean Code e DDD. Também automatizo fluxos de desenvolvimento com ferramentas de IA (Cursor, Skills e MCP), sempre com revisão humana. Perfil orientado à resolução de problemas técnicos ponta a ponta, com autonomia, senso de dono, comunicação clara com produto/UX e foco em aliar qualidade de código, confiabilidade e necessidades do negócio.</w:t>
+        <w:t xml:space="preserve">Desenvolvedor Full Stack com mais de 9 anos de experiência no desenvolvimento e evolução de aplicações web de alta criticidade, com foco em PHP, Laravel, MySQL, JavaScript e Vue.js. Atuação em plataformas de e-commerce, pagamentos e produtos digitais — incluindo cerca de 6 anos no ecossistema Locaweb/LWSA (Desk360 e Tray) — com modernização de sistemas legados, otimização de consultas, mensageria (RabbitMQ), integração com APIs externas, controle de acesso (ACL) e segurança de aplicações (OWASP, 2FA). Experiência no desenvolvimento de APIs REST, interfaces em Vue.js/Nuxt, testes automatizados (Pest), observabilidade (Datadog e New Relic) e arquitetura com Clean Code e DDD. Também automatizo fluxos de desenvolvimento com ferramentas de IA (Cursor e Skills), sempre com revisão humana. Perfil orientado à resolução de problemas técnicos ponta a ponta, com autonomia, senso de dono, comunicação clara com produto/UX e foco em aliar qualidade de código, confiabilidade e necessidades do negócio.</w:t>
       </w:r>
     </w:p>
     <w:p>
@@ -398,29 +398,29 @@
           <w:sz w:val="19"/>
           <w:szCs w:val="19"/>
         </w:rPr>
-        <w:t xml:space="preserve">Criei Skills e Commands no Cursor (MCP), com DDD e Clean Code, para apoiar análise, implementação e revisão de código.</w:t>
-      </w:r>
-    </w:p>
-    <w:p>
-      <w:pPr>
-        <w:numPr>
-          <w:ilvl w:val="0"/>
-          <w:numId w:val="1"/>
-        </w:numPr>
-        <w:spacing w:before="0" w:after="6" w:line="220" w:lineRule="auto"/>
-        <w:keepLines/>
-        <w:rPr>
-          <w:rFonts w:ascii="Arial" w:hAnsi="Arial" w:cs="Arial"/>
-        </w:rPr>
-      </w:pPr>
-      <w:r>
-        <w:rPr>
-          <w:rFonts w:ascii="Arial" w:hAnsi="Arial" w:cs="Arial"/>
-          <w:color w:val="000000"/>
-          <w:sz w:val="19"/>
-          <w:szCs w:val="19"/>
-        </w:rPr>
-        <w:t xml:space="preserve">Tecnologias: PHP, Laravel, MySQL, RabbitMQ, Vue.js, Nuxt.js, Pest, Datadog, Cursor, MCP.</w:t>
+        <w:t xml:space="preserve">Criei Skills e Commands no Cursor, com DDD e Clean Code, para apoiar análise, implementação e revisão de código.</w:t>
+      </w:r>
+    </w:p>
+    <w:p>
+      <w:pPr>
+        <w:numPr>
+          <w:ilvl w:val="0"/>
+          <w:numId w:val="1"/>
+        </w:numPr>
+        <w:spacing w:before="0" w:after="6" w:line="220" w:lineRule="auto"/>
+        <w:keepLines/>
+        <w:rPr>
+          <w:rFonts w:ascii="Arial" w:hAnsi="Arial" w:cs="Arial"/>
+        </w:rPr>
+      </w:pPr>
+      <w:r>
+        <w:rPr>
+          <w:rFonts w:ascii="Arial" w:hAnsi="Arial" w:cs="Arial"/>
+          <w:color w:val="000000"/>
+          <w:sz w:val="19"/>
+          <w:szCs w:val="19"/>
+        </w:rPr>
+        <w:t xml:space="preserve">Tecnologias: PHP, Laravel, MySQL, RabbitMQ, Vue.js, Nuxt.js, Pest, Datadog, Cursor.</w:t>
       </w:r>
     </w:p>
     <w:p>
@@ -1035,7 +1035,7 @@
           <w:sz w:val="20"/>
           <w:szCs w:val="20"/>
         </w:rPr>
-        <w:t xml:space="preserve">Git, Docker, Scrum, Kanban, Cursor, MCP.</w:t>
+        <w:t xml:space="preserve">Git, Docker, Scrum, Kanban, Cursor.</w:t>
       </w:r>
     </w:p>
     <w:p>

</xml_diff>